<commit_message>
Align school-specific resumes with essay wording and terminology
Co-Authored-By: Claude Sonnet 5.5 <noreply@anthropic.com>
Claude-Session: https://claude.ai/code/session_01CQFHgEGUEWsGr2fiz5rCwq
</commit_message>
<xml_diff>
--- a/resumes/essay_aligned/Resume_1Page_20261008_1.docx
+++ b/resumes/essay_aligned/Resume_1Page_20261008_1.docx
@@ -471,7 +471,7 @@
           <w:vertAlign w:val="baseline"/>
           <w:rtl w:val="0"/>
         </w:rPr>
-        <w:t xml:space="preserve">Developed Cello Square funnel analytics by combining Google Analytics 4 and Tag Manager with internal behavioral data, eliminating drop-off pages; drove a cosmetics-focused express analytics initiative (Korea→U.S./Japan) with customized dashboards and retention tracking.</w:t>
+        <w:t xml:space="preserve">Developed Cello Square funnel analytics (Google Analytics 4, Tag Manager, internal data), eliminating drop-off pages; drove a cosmetics express analytics initiative (Korea→U.S./Japan) with customized dashboards and retention tracking.</w:t>
       </w:r>
     </w:p>
     <w:p>
@@ -659,7 +659,7 @@
           <w:vertAlign w:val="baseline"/>
           <w:rtl w:val="0"/>
         </w:rPr>
-        <w:t xml:space="preserve">Developed a reservation misuse monitoring tool (SQL, Tableau) translating suspicious bookings into rules for sales teams to investigate-</w:t>
+        <w:t xml:space="preserve">Developed a reservation misuse monitoring tool translating suspicious bookings into rules for sales teams to investigate-</w:t>
       </w:r>
       <w:r>
         <w:rPr>
@@ -716,7 +716,7 @@
           <w:vertAlign w:val="baseline"/>
           <w:rtl w:val="0"/>
         </w:rPr>
-        <w:t xml:space="preserve">received the Korean Air Quarterly IT Excellence Project Award</w:t>
+        <w:t xml:space="preserve">received the Quarterly IT Excellence Project Award</w:t>
       </w:r>
       <w:r>
         <w:rPr>
@@ -805,7 +805,7 @@
           <w:vertAlign w:val="baseline"/>
           <w:rtl w:val="0"/>
         </w:rPr>
-        <w:t xml:space="preserve">Second-ranking manager leading a team of 7 across Manila, Cebu, and Guam; delivered </w:t>
+        <w:t xml:space="preserve">Second-ranking manager leading a team of 7 (Manila, Cebu, Guam); delivered </w:t>
       </w:r>
       <w:r>
         <w:rPr>

</xml_diff>